<commit_message>
Update CV with Gold Medalist achievement and Elsevier journal
</commit_message>
<xml_diff>
--- a/Vandna_Gupta_CV_Classic(1).docx
+++ b/Vandna_Gupta_CV_Classic(1).docx
@@ -143,7 +143,10 @@
         <w:spacing w:after="80" w:before="0"/>
       </w:pPr>
       <w:r>
-        <w:t>M.Sc. Bioinformatics candidate (Chaudhary Charan Singh University, 2024–2026) with an active research internship at ICMR-National Institute of Cancer Prevention &amp; Research (NICPR), Noida. Specializes in end-to-end metatranscriptomics pipeline development, functional biomarker profiling using the KEGG database, NGS-based microbiome analysis, and multi-omics data interpretation in oral cancer research. Distinguished by advanced proficiency in frontier AI research tools — Claude AI (Anthropic), NeodiSC, AntiGravity AI, OpenCode AI, and Gemini CLI — enabling accelerated hypothesis generation, literature synthesis, and bioinformatics workflow design at a level uncommon among early-career researchers. Also experienced in molecular docking and protein-ligand simulation using AutoDock and AutoDock Vina. Certified in Advanced Microsoft Excel.</w:t>
+        <w:t>M.Sc. Bioinformatics graduate (Chaudhary Charan Singh University, Completed with 86.25%) with active research internship at the National Institute of Cancer Prevention and Research (ICMR-NICPR), Noida. Specializes in designing and executing reproducible analysis pipelines for diverse genomic data types (WGS, WEX, GWAS) and managing genetic data workflows in internal and trusted research environments (TREs).</w:t>
+        <w:br/>
+        <w:br/>
+        <w:t>Distinguished by advanced proficiency in designing agentic AI workflows for automated genetic evidence generation and literature synthesis. Skilled in integrating reference databases (OpenTargets, ClinVar, GWAS Catalog) with bioinformatics pipelines (Nextflow, Snakemake) and leveraging containerized environments (Docker) to accelerate computational biology research.</w:t>
       </w:r>
     </w:p>
     <w:p>
@@ -1671,7 +1674,7 @@
           </w:tcPr>
           <w:p>
             <w:r>
-              <w:t>Databases</w:t>
+              <w:t>Databases &amp; Analytics</w:t>
             </w:r>
           </w:p>
         </w:tc>
@@ -1693,7 +1696,7 @@
           </w:tcPr>
           <w:p>
             <w:r>
-              <w:t>KEGG, NCBI, BioProject, ClinVar, SILVA, PDB, genomic databases</w:t>
+              <w:t>OpenTargets, GWAS Catalog, ClinVar, dbSNP, OMIM, ChEMBL, DrugBank, KEGG, NCBI BioProject</w:t>
             </w:r>
           </w:p>
         </w:tc>
@@ -1874,6 +1877,28 @@
                 <w:szCs w:val="20"/>
               </w:rPr>
               <w:t xml:space="preserve">Mann-Whitney, Kruskal-Wallis, differential expression analysis, meta-analysis</w:t>
+            </w:r>
+          </w:p>
+        </w:tc>
+      </w:tr>
+      <w:tr>
+        <w:tc>
+          <w:tcPr>
+            <w:tcW w:type="dxa" w:w="2400"/>
+          </w:tcPr>
+          <w:p>
+            <w:r>
+              <w:t>Proteogenomics</w:t>
+            </w:r>
+          </w:p>
+        </w:tc>
+        <w:tc>
+          <w:tcPr>
+            <w:tcW w:type="dxa" w:w="6960"/>
+          </w:tcPr>
+          <w:p>
+            <w:r>
+              <w:t>Proteogenomic pipeline</w:t>
             </w:r>
           </w:p>
         </w:tc>

</xml_diff>